<commit_message>
feat: add payment resolution template for 2025 external documents
</commit_message>
<xml_diff>
--- a/backend/storage/templates/Resoluciones Plantilla Pago FE DocExt 2025.docx
+++ b/backend/storage/templates/Resoluciones Plantilla Pago FE DocExt 2025.docx
@@ -1,6 +1,6 @@
 
 <file path=word/document.xml><?xml version="1.0" encoding="utf-8"?>
-<w:document xmlns:wpc="http://schemas.microsoft.com/office/word/2010/wordprocessingCanvas" xmlns:cx="http://schemas.microsoft.com/office/drawing/2014/chartex" xmlns:cx1="http://schemas.microsoft.com/office/drawing/2015/9/8/chartex" xmlns:cx2="http://schemas.microsoft.com/office/drawing/2015/10/21/chartex" xmlns:cx3="http://schemas.microsoft.com/office/drawing/2016/5/9/chartex" xmlns:cx4="http://schemas.microsoft.com/office/drawing/2016/5/10/chartex" xmlns:cx5="http://schemas.microsoft.com/office/drawing/2016/5/11/chartex" xmlns:cx6="http://schemas.microsoft.com/office/drawing/2016/5/12/chartex" xmlns:cx7="http://schemas.microsoft.com/office/drawing/2016/5/13/chartex" xmlns:cx8="http://schemas.microsoft.com/office/drawing/2016/5/14/chartex" xmlns:mc="http://schemas.openxmlformats.org/markup-compatibility/2006" xmlns:aink="http://schemas.microsoft.com/office/drawing/2016/ink" xmlns:am3d="http://schemas.microsoft.com/office/drawing/2017/model3d" xmlns:o="urn:schemas-microsoft-com:office:office" xmlns:r="http://schemas.openxmlformats.org/officeDocument/2006/relationships" xmlns:m="http://schemas.openxmlformats.org/officeDocument/2006/math" xmlns:v="urn:schemas-microsoft-com:vml" xmlns:wp14="http://schemas.microsoft.com/office/word/2010/wordprocessingDrawing" xmlns:wp="http://schemas.openxmlformats.org/drawingml/2006/wordprocessingDrawing" xmlns:w10="urn:schemas-microsoft-com:office:word" xmlns:w="http://schemas.openxmlformats.org/wordprocessingml/2006/main" xmlns:w14="http://schemas.microsoft.com/office/word/2010/wordml" xmlns:w15="http://schemas.microsoft.com/office/word/2012/wordml" xmlns:w16cid="http://schemas.microsoft.com/office/word/2016/wordml/cid" xmlns:w16se="http://schemas.microsoft.com/office/word/2015/wordml/symex" xmlns:wpg="http://schemas.microsoft.com/office/word/2010/wordprocessingGroup" xmlns:wpi="http://schemas.microsoft.com/office/word/2010/wordprocessingInk" xmlns:wne="http://schemas.microsoft.com/office/word/2006/wordml" xmlns:wps="http://schemas.microsoft.com/office/word/2010/wordprocessingShape" mc:Ignorable="w14 w15 w16se w16cid wp14">
+<w:document xmlns:wpc="http://schemas.microsoft.com/office/word/2010/wordprocessingCanvas" xmlns:cx="http://schemas.microsoft.com/office/drawing/2014/chartex" xmlns:mc="http://schemas.openxmlformats.org/markup-compatibility/2006" xmlns:o="urn:schemas-microsoft-com:office:office" xmlns:r="http://schemas.openxmlformats.org/officeDocument/2006/relationships" xmlns:m="http://schemas.openxmlformats.org/officeDocument/2006/math" xmlns:v="urn:schemas-microsoft-com:vml" xmlns:wp14="http://schemas.microsoft.com/office/word/2010/wordprocessingDrawing" xmlns:wp="http://schemas.openxmlformats.org/drawingml/2006/wordprocessingDrawing" xmlns:w10="urn:schemas-microsoft-com:office:word" xmlns:w="http://schemas.openxmlformats.org/wordprocessingml/2006/main" xmlns:w14="http://schemas.microsoft.com/office/word/2010/wordml" xmlns:w15="http://schemas.microsoft.com/office/word/2012/wordml" xmlns:w16se="http://schemas.microsoft.com/office/word/2015/wordml/symex" xmlns:wpg="http://schemas.microsoft.com/office/word/2010/wordprocessingGroup" xmlns:wpi="http://schemas.microsoft.com/office/word/2010/wordprocessingInk" xmlns:wne="http://schemas.microsoft.com/office/word/2006/wordml" xmlns:wps="http://schemas.microsoft.com/office/word/2010/wordprocessingShape" mc:Ignorable="w14 w15 w16se wp14">
   <w:body>
     <w:p>
       <w:pPr>
@@ -111,8 +111,6 @@
         </w:rPr>
         <w:fldChar w:fldCharType="end"/>
       </w:r>
-      <w:bookmarkStart w:id="0" w:name="_GoBack"/>
-      <w:bookmarkEnd w:id="0"/>
     </w:p>
     <w:p>
       <w:pPr>
@@ -277,27 +275,7 @@
           <w:sz w:val="22"/>
           <w:szCs w:val="22"/>
         </w:rPr>
-        <w:t xml:space="preserve">La Resolución </w:t>
-      </w:r>
-      <w:proofErr w:type="spellStart"/>
-      <w:r>
-        <w:rPr>
-          <w:rFonts w:ascii="Arial Narrow" w:hAnsi="Arial Narrow"/>
-          <w:color w:val="000000" w:themeColor="text1"/>
-          <w:sz w:val="22"/>
-          <w:szCs w:val="22"/>
-        </w:rPr>
-        <w:t>N°</w:t>
-      </w:r>
-      <w:proofErr w:type="spellEnd"/>
-      <w:r>
-        <w:rPr>
-          <w:rFonts w:ascii="Arial Narrow" w:hAnsi="Arial Narrow"/>
-          <w:color w:val="000000" w:themeColor="text1"/>
-          <w:sz w:val="22"/>
-          <w:szCs w:val="22"/>
-        </w:rPr>
-        <w:t xml:space="preserve"> 412-2025-CU de fecha 27 de octubre de 2025 donde se aprueba los presupuestos de los programas de maestrías y doctorados del proceso de admisión 2025 de la Escuela de Posgrado y donde se aprueba los presupuestos de los programas de Segunda Especialidad de la Facultad de Enfermería de la Universidad Nacional Pedro Ruiz Gallo;</w:t>
+        <w:t>La Resolución N° 412-2025-CU de fecha 27 de octubre de 2025 donde se aprueba los presupuestos de los programas de maestrías y doctorados del proceso de admisión 2025 de la Escuela de Posgrado y donde se aprueba los presupuestos de los programas de Segunda Especialidad de la Facultad de Enfermería de la Universidad Nacional Pedro Ruiz Gallo;</w:t>
       </w:r>
     </w:p>
     <w:p>
@@ -397,27 +375,7 @@
           <w:sz w:val="22"/>
           <w:szCs w:val="22"/>
         </w:rPr>
-        <w:t xml:space="preserve">Que, mediante resolución </w:t>
-      </w:r>
-      <w:proofErr w:type="spellStart"/>
-      <w:r>
-        <w:rPr>
-          <w:rFonts w:ascii="Arial Narrow" w:hAnsi="Arial Narrow"/>
-          <w:color w:val="000000" w:themeColor="text1"/>
-          <w:sz w:val="22"/>
-          <w:szCs w:val="22"/>
-        </w:rPr>
-        <w:t>N°</w:t>
-      </w:r>
-      <w:proofErr w:type="spellEnd"/>
-      <w:r>
-        <w:rPr>
-          <w:rFonts w:ascii="Arial Narrow" w:hAnsi="Arial Narrow"/>
-          <w:color w:val="000000" w:themeColor="text1"/>
-          <w:sz w:val="22"/>
-          <w:szCs w:val="22"/>
-        </w:rPr>
-        <w:t xml:space="preserve"> 041-2025-CF-FE de fecha 20 de junio de 2025, se aprueba el pago de S/ 50.00 por hora práctica solo en las asignaturas específicas, quedando la práctica clínica con S/ 30.00 la hora de la S. E.- Área del Cuidado a la Persona Enfermera Especialista en Emergencia y Desastres con mención en Cuidados Hospitalarios, S.E.-Área del Cuidado a la Persona Especialista en Enfermería Nefrológica y Urológica con mención en Diálisis, S.E.- Área del Cuidado a la Persona Enfermera Especialista en Centro Quirúrgico Especializado con mención en Centro Quirúrgico. 2025-2026;</w:t>
+        <w:t>Que, mediante resolución N° 041-2025-CF-FE de fecha 20 de junio de 2025, se aprueba el pago de S/ 50.00 por hora práctica solo en las asignaturas específicas, quedando la práctica clínica con S/ 30.00 la hora de la S. E.- Área del Cuidado a la Persona Enfermera Especialista en Emergencia y Desastres con mención en Cuidados Hospitalarios, S.E.-Área del Cuidado a la Persona Especialista en Enfermería Nefrológica y Urológica con mención en Diálisis, S.E.- Área del Cuidado a la Persona Enfermera Especialista en Centro Quirúrgico Especializado con mención en Centro Quirúrgico. 2025-2026;</w:t>
       </w:r>
     </w:p>
     <w:p>
@@ -450,27 +408,7 @@
           <w:sz w:val="22"/>
           <w:szCs w:val="22"/>
         </w:rPr>
-        <w:t xml:space="preserve">Que, mediante el Memorando </w:t>
-      </w:r>
-      <w:proofErr w:type="spellStart"/>
-      <w:r>
-        <w:rPr>
-          <w:rFonts w:ascii="Arial Narrow" w:hAnsi="Arial Narrow"/>
-          <w:color w:val="000000" w:themeColor="text1"/>
-          <w:sz w:val="22"/>
-          <w:szCs w:val="22"/>
-        </w:rPr>
-        <w:t>Nº</w:t>
-      </w:r>
-      <w:proofErr w:type="spellEnd"/>
-      <w:r>
-        <w:rPr>
-          <w:rFonts w:ascii="Arial Narrow" w:hAnsi="Arial Narrow"/>
-          <w:color w:val="000000" w:themeColor="text1"/>
-          <w:sz w:val="22"/>
-          <w:szCs w:val="22"/>
-        </w:rPr>
-        <w:t xml:space="preserve"> 071-2026-UPP de fecha 12 de enero de 2026 se asigna marco presupuestal para la Escuela de Posgrado en las partidas específicas 2.3.2.9.11 Locación de Servicios Realizados por Persona Natural por el monto de S/. 212,747.00 para atender el pago de docentes invitado/externo;</w:t>
+        <w:t>Que, mediante el Memorando Nº 071-2026-UPP de fecha 12 de enero de 2026 se asigna marco presupuestal para la Escuela de Posgrado en las partidas específicas 2.3.2.9.11 Locación de Servicios Realizados por Persona Natural por el monto de S/. 212,747.00 para atender el pago de docentes invitado/externo;</w:t>
       </w:r>
     </w:p>
     <w:p>
@@ -1255,7 +1193,27 @@
           <w:sz w:val="22"/>
           <w:szCs w:val="22"/>
         </w:rPr>
-        <w:t>${N_HORAS}</w:t>
+        <w:t>${N_HORAS</w:t>
+      </w:r>
+      <w:r>
+        <w:rPr>
+          <w:rFonts w:ascii="Arial Narrow" w:eastAsia="Arial Narrow" w:hAnsi="Arial Narrow" w:cs="Arial Narrow"/>
+          <w:noProof/>
+          <w:color w:val="000000" w:themeColor="text1"/>
+          <w:sz w:val="22"/>
+          <w:szCs w:val="22"/>
+        </w:rPr>
+        <w:t>_TEORICAS</w:t>
+      </w:r>
+      <w:r>
+        <w:rPr>
+          <w:rFonts w:ascii="Arial Narrow" w:eastAsia="Arial Narrow" w:hAnsi="Arial Narrow" w:cs="Arial Narrow"/>
+          <w:noProof/>
+          <w:color w:val="000000" w:themeColor="text1"/>
+          <w:sz w:val="22"/>
+          <w:szCs w:val="22"/>
+        </w:rPr>
+        <w:t>}</w:t>
       </w:r>
       <w:r>
         <w:rPr>
@@ -1310,7 +1268,27 @@
           <w:sz w:val="22"/>
           <w:szCs w:val="22"/>
         </w:rPr>
-        <w:t>${COSTO_X_HORA}</w:t>
+        <w:t>${COSTO_X_HORA</w:t>
+      </w:r>
+      <w:r>
+        <w:rPr>
+          <w:rFonts w:ascii="Arial Narrow" w:eastAsia="Arial Narrow" w:hAnsi="Arial Narrow" w:cs="Arial Narrow"/>
+          <w:noProof/>
+          <w:color w:val="000000" w:themeColor="text1"/>
+          <w:sz w:val="22"/>
+          <w:szCs w:val="22"/>
+        </w:rPr>
+        <w:t>_TEORICA</w:t>
+      </w:r>
+      <w:r>
+        <w:rPr>
+          <w:rFonts w:ascii="Arial Narrow" w:eastAsia="Arial Narrow" w:hAnsi="Arial Narrow" w:cs="Arial Narrow"/>
+          <w:noProof/>
+          <w:color w:val="000000" w:themeColor="text1"/>
+          <w:sz w:val="22"/>
+          <w:szCs w:val="22"/>
+        </w:rPr>
+        <w:t>}</w:t>
       </w:r>
       <w:r>
         <w:rPr>
@@ -1365,7 +1343,27 @@
           <w:sz w:val="22"/>
           <w:szCs w:val="22"/>
         </w:rPr>
-        <w:t>${N_HORAS}</w:t>
+        <w:t>${N_HORAS</w:t>
+      </w:r>
+      <w:r>
+        <w:rPr>
+          <w:rFonts w:ascii="Arial Narrow" w:eastAsia="Arial Narrow" w:hAnsi="Arial Narrow" w:cs="Arial Narrow"/>
+          <w:noProof/>
+          <w:color w:val="000000" w:themeColor="text1"/>
+          <w:sz w:val="22"/>
+          <w:szCs w:val="22"/>
+        </w:rPr>
+        <w:t>_PRACTICAS</w:t>
+      </w:r>
+      <w:r>
+        <w:rPr>
+          <w:rFonts w:ascii="Arial Narrow" w:eastAsia="Arial Narrow" w:hAnsi="Arial Narrow" w:cs="Arial Narrow"/>
+          <w:noProof/>
+          <w:color w:val="000000" w:themeColor="text1"/>
+          <w:sz w:val="22"/>
+          <w:szCs w:val="22"/>
+        </w:rPr>
+        <w:t>}</w:t>
       </w:r>
       <w:r>
         <w:rPr>
@@ -1420,7 +1418,27 @@
           <w:sz w:val="22"/>
           <w:szCs w:val="22"/>
         </w:rPr>
-        <w:t>${COSTO_X_HORA}</w:t>
+        <w:t>${COSTO_X_HORA</w:t>
+      </w:r>
+      <w:r>
+        <w:rPr>
+          <w:rFonts w:ascii="Arial Narrow" w:eastAsia="Arial Narrow" w:hAnsi="Arial Narrow" w:cs="Arial Narrow"/>
+          <w:noProof/>
+          <w:color w:val="000000" w:themeColor="text1"/>
+          <w:sz w:val="22"/>
+          <w:szCs w:val="22"/>
+        </w:rPr>
+        <w:t>_PRACTICA</w:t>
+      </w:r>
+      <w:r>
+        <w:rPr>
+          <w:rFonts w:ascii="Arial Narrow" w:eastAsia="Arial Narrow" w:hAnsi="Arial Narrow" w:cs="Arial Narrow"/>
+          <w:noProof/>
+          <w:color w:val="000000" w:themeColor="text1"/>
+          <w:sz w:val="22"/>
+          <w:szCs w:val="22"/>
+        </w:rPr>
+        <w:t>}</w:t>
       </w:r>
       <w:r>
         <w:rPr>
@@ -1762,27 +1780,7 @@
           <w:sz w:val="22"/>
           <w:szCs w:val="22"/>
         </w:rPr>
-        <w:t xml:space="preserve"> remite el anexo </w:t>
-      </w:r>
-      <w:proofErr w:type="spellStart"/>
-      <w:r>
-        <w:rPr>
-          <w:rFonts w:ascii="Arial Narrow" w:eastAsia="Arial Narrow" w:hAnsi="Arial Narrow" w:cs="Arial Narrow"/>
-          <w:color w:val="000000" w:themeColor="text1"/>
-          <w:sz w:val="22"/>
-          <w:szCs w:val="22"/>
-        </w:rPr>
-        <w:t>n°</w:t>
-      </w:r>
-      <w:proofErr w:type="spellEnd"/>
-      <w:r>
-        <w:rPr>
-          <w:rFonts w:ascii="Arial Narrow" w:eastAsia="Arial Narrow" w:hAnsi="Arial Narrow" w:cs="Arial Narrow"/>
-          <w:color w:val="000000" w:themeColor="text1"/>
-          <w:sz w:val="22"/>
-          <w:szCs w:val="22"/>
-        </w:rPr>
-        <w:t xml:space="preserve"> 02: Presentación de docente externo, presentado por </w:t>
+        <w:t xml:space="preserve"> remite el anexo n° 02: Presentación de docente externo, presentado por </w:t>
       </w:r>
       <w:r>
         <w:rPr>
@@ -2655,27 +2653,7 @@
           <w:sz w:val="22"/>
           <w:szCs w:val="22"/>
         </w:rPr>
-        <w:t xml:space="preserve">, remite el anexo </w:t>
-      </w:r>
-      <w:proofErr w:type="spellStart"/>
-      <w:r>
-        <w:rPr>
-          <w:rFonts w:ascii="Arial Narrow" w:eastAsia="Arial Narrow" w:hAnsi="Arial Narrow" w:cs="Arial Narrow"/>
-          <w:color w:val="000000" w:themeColor="text1"/>
-          <w:sz w:val="22"/>
-          <w:szCs w:val="22"/>
-        </w:rPr>
-        <w:t>n°</w:t>
-      </w:r>
-      <w:proofErr w:type="spellEnd"/>
-      <w:r>
-        <w:rPr>
-          <w:rFonts w:ascii="Arial Narrow" w:eastAsia="Arial Narrow" w:hAnsi="Arial Narrow" w:cs="Arial Narrow"/>
-          <w:color w:val="000000" w:themeColor="text1"/>
-          <w:sz w:val="22"/>
-          <w:szCs w:val="22"/>
-        </w:rPr>
-        <w:t xml:space="preserve"> 03: Conformidad de servicio del docente presentado por </w:t>
+        <w:t xml:space="preserve">, remite el anexo n° 03: Conformidad de servicio del docente presentado por </w:t>
       </w:r>
       <w:r>
         <w:rPr>
@@ -3285,27 +3263,7 @@
           <w:sz w:val="22"/>
           <w:szCs w:val="22"/>
         </w:rPr>
-        <w:t xml:space="preserve">En uso de las atribuciones que la Ley Universitaria 30220, el Estatuto de la Universidad y el Reglamento de la Escuela de Posgrado, le confieren al </w:t>
-      </w:r>
-      <w:proofErr w:type="gramStart"/>
-      <w:r>
-        <w:rPr>
-          <w:rFonts w:ascii="Arial Narrow" w:hAnsi="Arial Narrow"/>
-          <w:color w:val="000000" w:themeColor="text1"/>
-          <w:sz w:val="22"/>
-          <w:szCs w:val="22"/>
-        </w:rPr>
-        <w:t>Director</w:t>
-      </w:r>
-      <w:proofErr w:type="gramEnd"/>
-      <w:r>
-        <w:rPr>
-          <w:rFonts w:ascii="Arial Narrow" w:hAnsi="Arial Narrow"/>
-          <w:color w:val="000000" w:themeColor="text1"/>
-          <w:sz w:val="22"/>
-          <w:szCs w:val="22"/>
-        </w:rPr>
-        <w:t xml:space="preserve"> de la Escuela de la EPG – UNPRG;</w:t>
+        <w:t>En uso de las atribuciones que la Ley Universitaria 30220, el Estatuto de la Universidad y el Reglamento de la Escuela de Posgrado, le confieren al Director de la Escuela de la EPG – UNPRG;</w:t>
       </w:r>
     </w:p>
     <w:p>
@@ -3560,30 +3518,7 @@
           <w:sz w:val="22"/>
           <w:szCs w:val="22"/>
         </w:rPr>
-        <w:lastRenderedPageBreak/>
-        <w:t xml:space="preserve">RESOLUCIÓN </w:t>
-      </w:r>
-      <w:proofErr w:type="spellStart"/>
-      <w:r>
-        <w:rPr>
-          <w:rFonts w:ascii="Arial Narrow" w:hAnsi="Arial Narrow"/>
-          <w:b/>
-          <w:color w:val="000000" w:themeColor="text1"/>
-          <w:sz w:val="22"/>
-          <w:szCs w:val="22"/>
-        </w:rPr>
-        <w:t>N°</w:t>
-      </w:r>
-      <w:proofErr w:type="spellEnd"/>
-      <w:r>
-        <w:rPr>
-          <w:rFonts w:ascii="Arial Narrow" w:hAnsi="Arial Narrow"/>
-          <w:b/>
-          <w:color w:val="000000" w:themeColor="text1"/>
-          <w:sz w:val="22"/>
-          <w:szCs w:val="22"/>
-        </w:rPr>
-        <w:t xml:space="preserve"> </w:t>
+        <w:t xml:space="preserve">RESOLUCIÓN N° </w:t>
       </w:r>
       <w:r>
         <w:rPr>
@@ -4037,7 +3972,27 @@
           <w:sz w:val="22"/>
           <w:szCs w:val="22"/>
         </w:rPr>
-        <w:t>${N_HORAS}</w:t>
+        <w:t>${N_HORAS</w:t>
+      </w:r>
+      <w:r>
+        <w:rPr>
+          <w:rFonts w:ascii="Arial Narrow" w:eastAsia="Arial Narrow" w:hAnsi="Arial Narrow" w:cs="Arial Narrow"/>
+          <w:noProof/>
+          <w:color w:val="000000" w:themeColor="text1"/>
+          <w:sz w:val="22"/>
+          <w:szCs w:val="22"/>
+        </w:rPr>
+        <w:t>_TEORICAS</w:t>
+      </w:r>
+      <w:r>
+        <w:rPr>
+          <w:rFonts w:ascii="Arial Narrow" w:eastAsia="Arial Narrow" w:hAnsi="Arial Narrow" w:cs="Arial Narrow"/>
+          <w:noProof/>
+          <w:color w:val="000000" w:themeColor="text1"/>
+          <w:sz w:val="22"/>
+          <w:szCs w:val="22"/>
+        </w:rPr>
+        <w:t>}</w:t>
       </w:r>
       <w:r>
         <w:rPr>
@@ -4092,7 +4047,27 @@
           <w:sz w:val="22"/>
           <w:szCs w:val="22"/>
         </w:rPr>
-        <w:t>${COSTO_X_HORA}</w:t>
+        <w:t>${COSTO_X_HORA</w:t>
+      </w:r>
+      <w:r>
+        <w:rPr>
+          <w:rFonts w:ascii="Arial Narrow" w:eastAsia="Arial Narrow" w:hAnsi="Arial Narrow" w:cs="Arial Narrow"/>
+          <w:noProof/>
+          <w:color w:val="000000" w:themeColor="text1"/>
+          <w:sz w:val="22"/>
+          <w:szCs w:val="22"/>
+        </w:rPr>
+        <w:t>_TEORICA</w:t>
+      </w:r>
+      <w:r>
+        <w:rPr>
+          <w:rFonts w:ascii="Arial Narrow" w:eastAsia="Arial Narrow" w:hAnsi="Arial Narrow" w:cs="Arial Narrow"/>
+          <w:noProof/>
+          <w:color w:val="000000" w:themeColor="text1"/>
+          <w:sz w:val="22"/>
+          <w:szCs w:val="22"/>
+        </w:rPr>
+        <w:t>}</w:t>
       </w:r>
       <w:r>
         <w:rPr>
@@ -4147,7 +4122,27 @@
           <w:sz w:val="22"/>
           <w:szCs w:val="22"/>
         </w:rPr>
-        <w:t>${N_HORAS}</w:t>
+        <w:t>${N_HORAS</w:t>
+      </w:r>
+      <w:r>
+        <w:rPr>
+          <w:rFonts w:ascii="Arial Narrow" w:eastAsia="Arial Narrow" w:hAnsi="Arial Narrow" w:cs="Arial Narrow"/>
+          <w:noProof/>
+          <w:color w:val="000000" w:themeColor="text1"/>
+          <w:sz w:val="22"/>
+          <w:szCs w:val="22"/>
+        </w:rPr>
+        <w:t>_PRACTICAS</w:t>
+      </w:r>
+      <w:r>
+        <w:rPr>
+          <w:rFonts w:ascii="Arial Narrow" w:eastAsia="Arial Narrow" w:hAnsi="Arial Narrow" w:cs="Arial Narrow"/>
+          <w:noProof/>
+          <w:color w:val="000000" w:themeColor="text1"/>
+          <w:sz w:val="22"/>
+          <w:szCs w:val="22"/>
+        </w:rPr>
+        <w:t>}</w:t>
       </w:r>
       <w:r>
         <w:rPr>
@@ -4202,7 +4197,29 @@
           <w:sz w:val="22"/>
           <w:szCs w:val="22"/>
         </w:rPr>
-        <w:t>${COSTO_X_HORA}</w:t>
+        <w:t>${COSTO_X_HORA</w:t>
+      </w:r>
+      <w:r>
+        <w:rPr>
+          <w:rFonts w:ascii="Arial Narrow" w:eastAsia="Arial Narrow" w:hAnsi="Arial Narrow" w:cs="Arial Narrow"/>
+          <w:noProof/>
+          <w:color w:val="000000" w:themeColor="text1"/>
+          <w:sz w:val="22"/>
+          <w:szCs w:val="22"/>
+        </w:rPr>
+        <w:t>_PRACTICA</w:t>
+      </w:r>
+      <w:bookmarkStart w:id="0" w:name="_GoBack"/>
+      <w:bookmarkEnd w:id="0"/>
+      <w:r>
+        <w:rPr>
+          <w:rFonts w:ascii="Arial Narrow" w:eastAsia="Arial Narrow" w:hAnsi="Arial Narrow" w:cs="Arial Narrow"/>
+          <w:noProof/>
+          <w:color w:val="000000" w:themeColor="text1"/>
+          <w:sz w:val="22"/>
+          <w:szCs w:val="22"/>
+        </w:rPr>
+        <w:t>}</w:t>
       </w:r>
       <w:r>
         <w:rPr>
@@ -5372,28 +5389,7 @@
           <w:szCs w:val="22"/>
         </w:rPr>
         <w:tab/>
-      </w:r>
-      <w:proofErr w:type="gramStart"/>
-      <w:r>
-        <w:rPr>
-          <w:rFonts w:ascii="Arial Narrow" w:hAnsi="Arial Narrow"/>
-          <w:b/>
-          <w:color w:val="000000" w:themeColor="text1"/>
-          <w:sz w:val="22"/>
-          <w:szCs w:val="22"/>
-        </w:rPr>
-        <w:t>Secretaria</w:t>
-      </w:r>
-      <w:proofErr w:type="gramEnd"/>
-      <w:r>
-        <w:rPr>
-          <w:rFonts w:ascii="Arial Narrow" w:hAnsi="Arial Narrow"/>
-          <w:b/>
-          <w:color w:val="000000" w:themeColor="text1"/>
-          <w:sz w:val="22"/>
-          <w:szCs w:val="22"/>
-        </w:rPr>
-        <w:t xml:space="preserve"> EPG</w:t>
+        <w:t>Secretaria EPG</w:t>
       </w:r>
     </w:p>
     <w:p>
@@ -5458,7 +5454,7 @@
 </file>
 
 <file path=word/endnotes.xml><?xml version="1.0" encoding="utf-8"?>
-<w:endnotes xmlns:wpc="http://schemas.microsoft.com/office/word/2010/wordprocessingCanvas" xmlns:cx="http://schemas.microsoft.com/office/drawing/2014/chartex" xmlns:cx1="http://schemas.microsoft.com/office/drawing/2015/9/8/chartex" xmlns:cx2="http://schemas.microsoft.com/office/drawing/2015/10/21/chartex" xmlns:cx3="http://schemas.microsoft.com/office/drawing/2016/5/9/chartex" xmlns:cx4="http://schemas.microsoft.com/office/drawing/2016/5/10/chartex" xmlns:cx5="http://schemas.microsoft.com/office/drawing/2016/5/11/chartex" xmlns:cx6="http://schemas.microsoft.com/office/drawing/2016/5/12/chartex" xmlns:cx7="http://schemas.microsoft.com/office/drawing/2016/5/13/chartex" xmlns:cx8="http://schemas.microsoft.com/office/drawing/2016/5/14/chartex" xmlns:mc="http://schemas.openxmlformats.org/markup-compatibility/2006" xmlns:aink="http://schemas.microsoft.com/office/drawing/2016/ink" xmlns:am3d="http://schemas.microsoft.com/office/drawing/2017/model3d" xmlns:o="urn:schemas-microsoft-com:office:office" xmlns:r="http://schemas.openxmlformats.org/officeDocument/2006/relationships" xmlns:m="http://schemas.openxmlformats.org/officeDocument/2006/math" xmlns:v="urn:schemas-microsoft-com:vml" xmlns:wp14="http://schemas.microsoft.com/office/word/2010/wordprocessingDrawing" xmlns:wp="http://schemas.openxmlformats.org/drawingml/2006/wordprocessingDrawing" xmlns:w10="urn:schemas-microsoft-com:office:word" xmlns:w="http://schemas.openxmlformats.org/wordprocessingml/2006/main" xmlns:w14="http://schemas.microsoft.com/office/word/2010/wordml" xmlns:w15="http://schemas.microsoft.com/office/word/2012/wordml" xmlns:w16cid="http://schemas.microsoft.com/office/word/2016/wordml/cid" xmlns:w16se="http://schemas.microsoft.com/office/word/2015/wordml/symex" xmlns:wpg="http://schemas.microsoft.com/office/word/2010/wordprocessingGroup" xmlns:wpi="http://schemas.microsoft.com/office/word/2010/wordprocessingInk" xmlns:wne="http://schemas.microsoft.com/office/word/2006/wordml" xmlns:wps="http://schemas.microsoft.com/office/word/2010/wordprocessingShape" mc:Ignorable="w14 w15 w16se w16cid wp14">
+<w:endnotes xmlns:wpc="http://schemas.microsoft.com/office/word/2010/wordprocessingCanvas" xmlns:cx="http://schemas.microsoft.com/office/drawing/2014/chartex" xmlns:mc="http://schemas.openxmlformats.org/markup-compatibility/2006" xmlns:o="urn:schemas-microsoft-com:office:office" xmlns:r="http://schemas.openxmlformats.org/officeDocument/2006/relationships" xmlns:m="http://schemas.openxmlformats.org/officeDocument/2006/math" xmlns:v="urn:schemas-microsoft-com:vml" xmlns:wp14="http://schemas.microsoft.com/office/word/2010/wordprocessingDrawing" xmlns:wp="http://schemas.openxmlformats.org/drawingml/2006/wordprocessingDrawing" xmlns:w10="urn:schemas-microsoft-com:office:word" xmlns:w="http://schemas.openxmlformats.org/wordprocessingml/2006/main" xmlns:w14="http://schemas.microsoft.com/office/word/2010/wordml" xmlns:w15="http://schemas.microsoft.com/office/word/2012/wordml" xmlns:w16se="http://schemas.microsoft.com/office/word/2015/wordml/symex" xmlns:wpg="http://schemas.microsoft.com/office/word/2010/wordprocessingGroup" xmlns:wpi="http://schemas.microsoft.com/office/word/2010/wordprocessingInk" xmlns:wne="http://schemas.microsoft.com/office/word/2006/wordml" xmlns:wps="http://schemas.microsoft.com/office/word/2010/wordprocessingShape" mc:Ignorable="w14 w15 w16se wp14">
   <w:endnote w:type="separator" w:id="-1">
     <w:p>
       <w:r>
@@ -5477,7 +5473,7 @@
 </file>
 
 <file path=word/footer1.xml><?xml version="1.0" encoding="utf-8"?>
-<w:ftr xmlns:wpc="http://schemas.microsoft.com/office/word/2010/wordprocessingCanvas" xmlns:cx="http://schemas.microsoft.com/office/drawing/2014/chartex" xmlns:cx1="http://schemas.microsoft.com/office/drawing/2015/9/8/chartex" xmlns:cx2="http://schemas.microsoft.com/office/drawing/2015/10/21/chartex" xmlns:cx3="http://schemas.microsoft.com/office/drawing/2016/5/9/chartex" xmlns:cx4="http://schemas.microsoft.com/office/drawing/2016/5/10/chartex" xmlns:cx5="http://schemas.microsoft.com/office/drawing/2016/5/11/chartex" xmlns:cx6="http://schemas.microsoft.com/office/drawing/2016/5/12/chartex" xmlns:cx7="http://schemas.microsoft.com/office/drawing/2016/5/13/chartex" xmlns:cx8="http://schemas.microsoft.com/office/drawing/2016/5/14/chartex" xmlns:mc="http://schemas.openxmlformats.org/markup-compatibility/2006" xmlns:aink="http://schemas.microsoft.com/office/drawing/2016/ink" xmlns:am3d="http://schemas.microsoft.com/office/drawing/2017/model3d" xmlns:o="urn:schemas-microsoft-com:office:office" xmlns:r="http://schemas.openxmlformats.org/officeDocument/2006/relationships" xmlns:m="http://schemas.openxmlformats.org/officeDocument/2006/math" xmlns:v="urn:schemas-microsoft-com:vml" xmlns:wp14="http://schemas.microsoft.com/office/word/2010/wordprocessingDrawing" xmlns:wp="http://schemas.openxmlformats.org/drawingml/2006/wordprocessingDrawing" xmlns:w10="urn:schemas-microsoft-com:office:word" xmlns:w="http://schemas.openxmlformats.org/wordprocessingml/2006/main" xmlns:w14="http://schemas.microsoft.com/office/word/2010/wordml" xmlns:w15="http://schemas.microsoft.com/office/word/2012/wordml" xmlns:w16cid="http://schemas.microsoft.com/office/word/2016/wordml/cid" xmlns:w16se="http://schemas.microsoft.com/office/word/2015/wordml/symex" xmlns:wpg="http://schemas.microsoft.com/office/word/2010/wordprocessingGroup" xmlns:wpi="http://schemas.microsoft.com/office/word/2010/wordprocessingInk" xmlns:wne="http://schemas.microsoft.com/office/word/2006/wordml" xmlns:wps="http://schemas.microsoft.com/office/word/2010/wordprocessingShape" mc:Ignorable="w14 w15 w16se w16cid wp14">
+<w:ftr xmlns:wpc="http://schemas.microsoft.com/office/word/2010/wordprocessingCanvas" xmlns:cx="http://schemas.microsoft.com/office/drawing/2014/chartex" xmlns:mc="http://schemas.openxmlformats.org/markup-compatibility/2006" xmlns:o="urn:schemas-microsoft-com:office:office" xmlns:r="http://schemas.openxmlformats.org/officeDocument/2006/relationships" xmlns:m="http://schemas.openxmlformats.org/officeDocument/2006/math" xmlns:v="urn:schemas-microsoft-com:vml" xmlns:wp14="http://schemas.microsoft.com/office/word/2010/wordprocessingDrawing" xmlns:wp="http://schemas.openxmlformats.org/drawingml/2006/wordprocessingDrawing" xmlns:w10="urn:schemas-microsoft-com:office:word" xmlns:w="http://schemas.openxmlformats.org/wordprocessingml/2006/main" xmlns:w14="http://schemas.microsoft.com/office/word/2010/wordml" xmlns:w15="http://schemas.microsoft.com/office/word/2012/wordml" xmlns:w16se="http://schemas.microsoft.com/office/word/2015/wordml/symex" xmlns:wpg="http://schemas.microsoft.com/office/word/2010/wordprocessingGroup" xmlns:wpi="http://schemas.microsoft.com/office/word/2010/wordprocessingInk" xmlns:wne="http://schemas.microsoft.com/office/word/2006/wordml" xmlns:wps="http://schemas.microsoft.com/office/word/2010/wordprocessingShape" mc:Ignorable="w14 w15 w16se wp14">
   <w:p>
     <w:pPr>
       <w:pStyle w:val="Piedepgina"/>
@@ -5485,7 +5481,7 @@
     <w:r>
       <w:rPr>
         <w:noProof/>
-        <w:lang w:eastAsia="es-PE"/>
+        <w:lang w:val="es-ES"/>
       </w:rPr>
       <mc:AlternateContent>
         <mc:Choice Requires="wps">
@@ -5558,19 +5554,7 @@
                               <w:sz w:val="16"/>
                               <w:szCs w:val="16"/>
                             </w:rPr>
-                            <w:t xml:space="preserve">Av. Huamachuco </w:t>
-                          </w:r>
-                          <w:proofErr w:type="spellStart"/>
-                          <w:r>
-                            <w:rPr>
-                              <w:rFonts w:ascii="Maiandra GD" w:hAnsi="Maiandra GD" w:cstheme="minorHAnsi"/>
-                              <w:i/>
-                              <w:iCs/>
-                              <w:color w:val="000000" w:themeColor="text1"/>
-                              <w:sz w:val="16"/>
-                              <w:szCs w:val="16"/>
-                            </w:rPr>
-                            <w:t>N</w:t>
+                            <w:t>Av. Huamachuco N</w:t>
                           </w:r>
                           <w:r>
                             <w:rPr>
@@ -5583,7 +5567,6 @@
                             </w:rPr>
                             <w:t>°</w:t>
                           </w:r>
-                          <w:proofErr w:type="spellEnd"/>
                           <w:r>
                             <w:rPr>
                               <w:rFonts w:ascii="Maiandra GD" w:hAnsi="Maiandra GD" w:cstheme="minorHAnsi"/>
@@ -5783,7 +5766,7 @@
             </wp:anchor>
           </w:drawing>
         </mc:Choice>
-        <mc:Fallback>
+        <mc:Fallback xmlns:w16cid="http://schemas.microsoft.com/office/word/2016/wordml/cid" xmlns:am3d="http://schemas.microsoft.com/office/drawing/2017/model3d" xmlns:aink="http://schemas.microsoft.com/office/drawing/2016/ink" xmlns:cx8="http://schemas.microsoft.com/office/drawing/2016/5/14/chartex" xmlns:cx7="http://schemas.microsoft.com/office/drawing/2016/5/13/chartex" xmlns:cx6="http://schemas.microsoft.com/office/drawing/2016/5/12/chartex" xmlns:cx5="http://schemas.microsoft.com/office/drawing/2016/5/11/chartex" xmlns:cx4="http://schemas.microsoft.com/office/drawing/2016/5/10/chartex" xmlns:cx3="http://schemas.microsoft.com/office/drawing/2016/5/9/chartex" xmlns:cx2="http://schemas.microsoft.com/office/drawing/2015/10/21/chartex" xmlns:cx1="http://schemas.microsoft.com/office/drawing/2015/9/8/chartex">
           <w:pict>
             <v:rect w14:anchorId="16CC473D" id="Rectángulo 14" o:spid="_x0000_s1026" style="position:absolute;margin-left:-8.5pt;margin-top:7.15pt;width:488.35pt;height:34.45pt;z-index:251664384;visibility:visible;mso-wrap-style:square;mso-width-percent:0;mso-height-percent:0;mso-wrap-distance-left:9pt;mso-wrap-distance-top:0;mso-wrap-distance-right:9pt;mso-wrap-distance-bottom:0;mso-position-horizontal:absolute;mso-position-horizontal-relative:margin;mso-position-vertical:absolute;mso-position-vertical-relative:text;mso-width-percent:0;mso-height-percent:0;mso-width-relative:margin;mso-height-relative:margin;v-text-anchor:middle" o:gfxdata="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" filled="f" stroked="f" strokeweight="1pt">
               <v:textbox>
@@ -6024,7 +6007,7 @@
     <w:r>
       <w:rPr>
         <w:noProof/>
-        <w:lang w:eastAsia="es-PE"/>
+        <w:lang w:val="es-ES"/>
       </w:rPr>
       <mc:AlternateContent>
         <mc:Choice Requires="wps">
@@ -6082,7 +6065,7 @@
             </wp:anchor>
           </w:drawing>
         </mc:Choice>
-        <mc:Fallback xmlns:oel="http://schemas.microsoft.com/office/2019/extlst" xmlns:w16sdtdh="http://schemas.microsoft.com/office/word/2020/wordml/sdtdatahash" xmlns:w16="http://schemas.microsoft.com/office/word/2018/wordml" xmlns:w16cex="http://schemas.microsoft.com/office/word/2018/wordml/cex">
+        <mc:Fallback xmlns:w16cex="http://schemas.microsoft.com/office/word/2018/wordml/cex" xmlns:w16="http://schemas.microsoft.com/office/word/2018/wordml" xmlns:w16sdtdh="http://schemas.microsoft.com/office/word/2020/wordml/sdtdatahash" xmlns:oel="http://schemas.microsoft.com/office/2019/extlst" xmlns:w16cid="http://schemas.microsoft.com/office/word/2016/wordml/cid" xmlns:am3d="http://schemas.microsoft.com/office/drawing/2017/model3d" xmlns:aink="http://schemas.microsoft.com/office/drawing/2016/ink" xmlns:cx8="http://schemas.microsoft.com/office/drawing/2016/5/14/chartex" xmlns:cx7="http://schemas.microsoft.com/office/drawing/2016/5/13/chartex" xmlns:cx6="http://schemas.microsoft.com/office/drawing/2016/5/12/chartex" xmlns:cx5="http://schemas.microsoft.com/office/drawing/2016/5/11/chartex" xmlns:cx4="http://schemas.microsoft.com/office/drawing/2016/5/10/chartex" xmlns:cx3="http://schemas.microsoft.com/office/drawing/2016/5/9/chartex" xmlns:cx2="http://schemas.microsoft.com/office/drawing/2015/10/21/chartex" xmlns:cx1="http://schemas.microsoft.com/office/drawing/2015/9/8/chartex">
           <w:pict>
             <v:line w14:anchorId="649EA503" id="Conector recto 13" o:spid="_x0000_s1026" style="position:absolute;flip:y;z-index:251663360;visibility:visible;mso-wrap-style:square;mso-width-percent:0;mso-height-percent:0;mso-wrap-distance-left:9pt;mso-wrap-distance-top:0;mso-wrap-distance-right:9pt;mso-wrap-distance-bottom:0;mso-position-horizontal:center;mso-position-horizontal-relative:page;mso-position-vertical:absolute;mso-position-vertical-relative:text;mso-width-percent:0;mso-height-percent:0;mso-width-relative:margin;mso-height-relative:margin" from="0,12.6pt" to="474pt,12.6pt" o:gfxdata="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" strokecolor="black [3200]" strokeweight=".5pt">
               <v:stroke joinstyle="miter"/>
@@ -6097,7 +6080,7 @@
 </file>
 
 <file path=word/footnotes.xml><?xml version="1.0" encoding="utf-8"?>
-<w:footnotes xmlns:wpc="http://schemas.microsoft.com/office/word/2010/wordprocessingCanvas" xmlns:cx="http://schemas.microsoft.com/office/drawing/2014/chartex" xmlns:cx1="http://schemas.microsoft.com/office/drawing/2015/9/8/chartex" xmlns:cx2="http://schemas.microsoft.com/office/drawing/2015/10/21/chartex" xmlns:cx3="http://schemas.microsoft.com/office/drawing/2016/5/9/chartex" xmlns:cx4="http://schemas.microsoft.com/office/drawing/2016/5/10/chartex" xmlns:cx5="http://schemas.microsoft.com/office/drawing/2016/5/11/chartex" xmlns:cx6="http://schemas.microsoft.com/office/drawing/2016/5/12/chartex" xmlns:cx7="http://schemas.microsoft.com/office/drawing/2016/5/13/chartex" xmlns:cx8="http://schemas.microsoft.com/office/drawing/2016/5/14/chartex" xmlns:mc="http://schemas.openxmlformats.org/markup-compatibility/2006" xmlns:aink="http://schemas.microsoft.com/office/drawing/2016/ink" xmlns:am3d="http://schemas.microsoft.com/office/drawing/2017/model3d" xmlns:o="urn:schemas-microsoft-com:office:office" xmlns:r="http://schemas.openxmlformats.org/officeDocument/2006/relationships" xmlns:m="http://schemas.openxmlformats.org/officeDocument/2006/math" xmlns:v="urn:schemas-microsoft-com:vml" xmlns:wp14="http://schemas.microsoft.com/office/word/2010/wordprocessingDrawing" xmlns:wp="http://schemas.openxmlformats.org/drawingml/2006/wordprocessingDrawing" xmlns:w10="urn:schemas-microsoft-com:office:word" xmlns:w="http://schemas.openxmlformats.org/wordprocessingml/2006/main" xmlns:w14="http://schemas.microsoft.com/office/word/2010/wordml" xmlns:w15="http://schemas.microsoft.com/office/word/2012/wordml" xmlns:w16cid="http://schemas.microsoft.com/office/word/2016/wordml/cid" xmlns:w16se="http://schemas.microsoft.com/office/word/2015/wordml/symex" xmlns:wpg="http://schemas.microsoft.com/office/word/2010/wordprocessingGroup" xmlns:wpi="http://schemas.microsoft.com/office/word/2010/wordprocessingInk" xmlns:wne="http://schemas.microsoft.com/office/word/2006/wordml" xmlns:wps="http://schemas.microsoft.com/office/word/2010/wordprocessingShape" mc:Ignorable="w14 w15 w16se w16cid wp14">
+<w:footnotes xmlns:wpc="http://schemas.microsoft.com/office/word/2010/wordprocessingCanvas" xmlns:cx="http://schemas.microsoft.com/office/drawing/2014/chartex" xmlns:mc="http://schemas.openxmlformats.org/markup-compatibility/2006" xmlns:o="urn:schemas-microsoft-com:office:office" xmlns:r="http://schemas.openxmlformats.org/officeDocument/2006/relationships" xmlns:m="http://schemas.openxmlformats.org/officeDocument/2006/math" xmlns:v="urn:schemas-microsoft-com:vml" xmlns:wp14="http://schemas.microsoft.com/office/word/2010/wordprocessingDrawing" xmlns:wp="http://schemas.openxmlformats.org/drawingml/2006/wordprocessingDrawing" xmlns:w10="urn:schemas-microsoft-com:office:word" xmlns:w="http://schemas.openxmlformats.org/wordprocessingml/2006/main" xmlns:w14="http://schemas.microsoft.com/office/word/2010/wordml" xmlns:w15="http://schemas.microsoft.com/office/word/2012/wordml" xmlns:w16se="http://schemas.microsoft.com/office/word/2015/wordml/symex" xmlns:wpg="http://schemas.microsoft.com/office/word/2010/wordprocessingGroup" xmlns:wpi="http://schemas.microsoft.com/office/word/2010/wordprocessingInk" xmlns:wne="http://schemas.microsoft.com/office/word/2006/wordml" xmlns:wps="http://schemas.microsoft.com/office/word/2010/wordprocessingShape" mc:Ignorable="w14 w15 w16se wp14">
   <w:footnote w:type="separator" w:id="-1">
     <w:p>
       <w:r>
@@ -6116,7 +6099,7 @@
 </file>
 
 <file path=word/header1.xml><?xml version="1.0" encoding="utf-8"?>
-<w:hdr xmlns:wpc="http://schemas.microsoft.com/office/word/2010/wordprocessingCanvas" xmlns:cx="http://schemas.microsoft.com/office/drawing/2014/chartex" xmlns:cx1="http://schemas.microsoft.com/office/drawing/2015/9/8/chartex" xmlns:cx2="http://schemas.microsoft.com/office/drawing/2015/10/21/chartex" xmlns:cx3="http://schemas.microsoft.com/office/drawing/2016/5/9/chartex" xmlns:cx4="http://schemas.microsoft.com/office/drawing/2016/5/10/chartex" xmlns:cx5="http://schemas.microsoft.com/office/drawing/2016/5/11/chartex" xmlns:cx6="http://schemas.microsoft.com/office/drawing/2016/5/12/chartex" xmlns:cx7="http://schemas.microsoft.com/office/drawing/2016/5/13/chartex" xmlns:cx8="http://schemas.microsoft.com/office/drawing/2016/5/14/chartex" xmlns:mc="http://schemas.openxmlformats.org/markup-compatibility/2006" xmlns:aink="http://schemas.microsoft.com/office/drawing/2016/ink" xmlns:am3d="http://schemas.microsoft.com/office/drawing/2017/model3d" xmlns:o="urn:schemas-microsoft-com:office:office" xmlns:r="http://schemas.openxmlformats.org/officeDocument/2006/relationships" xmlns:m="http://schemas.openxmlformats.org/officeDocument/2006/math" xmlns:v="urn:schemas-microsoft-com:vml" xmlns:wp14="http://schemas.microsoft.com/office/word/2010/wordprocessingDrawing" xmlns:wp="http://schemas.openxmlformats.org/drawingml/2006/wordprocessingDrawing" xmlns:w10="urn:schemas-microsoft-com:office:word" xmlns:w="http://schemas.openxmlformats.org/wordprocessingml/2006/main" xmlns:w14="http://schemas.microsoft.com/office/word/2010/wordml" xmlns:w15="http://schemas.microsoft.com/office/word/2012/wordml" xmlns:w16cid="http://schemas.microsoft.com/office/word/2016/wordml/cid" xmlns:w16se="http://schemas.microsoft.com/office/word/2015/wordml/symex" xmlns:wpg="http://schemas.microsoft.com/office/word/2010/wordprocessingGroup" xmlns:wpi="http://schemas.microsoft.com/office/word/2010/wordprocessingInk" xmlns:wne="http://schemas.microsoft.com/office/word/2006/wordml" xmlns:wps="http://schemas.microsoft.com/office/word/2010/wordprocessingShape" mc:Ignorable="w14 w15 w16se w16cid wp14">
+<w:hdr xmlns:wpc="http://schemas.microsoft.com/office/word/2010/wordprocessingCanvas" xmlns:cx="http://schemas.microsoft.com/office/drawing/2014/chartex" xmlns:mc="http://schemas.openxmlformats.org/markup-compatibility/2006" xmlns:o="urn:schemas-microsoft-com:office:office" xmlns:r="http://schemas.openxmlformats.org/officeDocument/2006/relationships" xmlns:m="http://schemas.openxmlformats.org/officeDocument/2006/math" xmlns:v="urn:schemas-microsoft-com:vml" xmlns:wp14="http://schemas.microsoft.com/office/word/2010/wordprocessingDrawing" xmlns:wp="http://schemas.openxmlformats.org/drawingml/2006/wordprocessingDrawing" xmlns:w10="urn:schemas-microsoft-com:office:word" xmlns:w="http://schemas.openxmlformats.org/wordprocessingml/2006/main" xmlns:w14="http://schemas.microsoft.com/office/word/2010/wordml" xmlns:w15="http://schemas.microsoft.com/office/word/2012/wordml" xmlns:w16se="http://schemas.microsoft.com/office/word/2015/wordml/symex" xmlns:wpg="http://schemas.microsoft.com/office/word/2010/wordprocessingGroup" xmlns:wpi="http://schemas.microsoft.com/office/word/2010/wordprocessingInk" xmlns:wne="http://schemas.microsoft.com/office/word/2006/wordml" xmlns:wps="http://schemas.microsoft.com/office/word/2010/wordprocessingShape" mc:Ignorable="w14 w15 w16se wp14">
   <w:p>
     <w:pPr>
       <w:pStyle w:val="Textoindependiente"/>
@@ -6135,7 +6118,7 @@
         <w:noProof/>
         <w:sz w:val="28"/>
         <w:szCs w:val="28"/>
-        <w:lang w:eastAsia="es-PE"/>
+        <w:lang w:val="es-ES"/>
       </w:rPr>
       <w:drawing>
         <wp:anchor distT="0" distB="0" distL="114300" distR="114300" simplePos="0" relativeHeight="251661312" behindDoc="1" locked="0" layoutInCell="1" allowOverlap="1" wp14:anchorId="60B6D764" wp14:editId="61720998">
@@ -6212,7 +6195,7 @@
       <w:rPr>
         <w:rFonts w:ascii="Arial Unicode MS" w:eastAsia="Arial Unicode MS" w:hAnsi="Arial Unicode MS" w:cs="Arial Unicode MS"/>
         <w:noProof/>
-        <w:lang w:eastAsia="es-PE"/>
+        <w:lang w:val="es-ES"/>
       </w:rPr>
       <w:drawing>
         <wp:anchor distT="0" distB="0" distL="114300" distR="114300" simplePos="0" relativeHeight="251660288" behindDoc="0" locked="0" layoutInCell="1" allowOverlap="1" wp14:anchorId="6EE6E621" wp14:editId="2B177EFE">
@@ -6430,7 +6413,7 @@
     <w:r>
       <w:rPr>
         <w:noProof/>
-        <w:lang w:eastAsia="es-PE"/>
+        <w:lang w:val="es-ES"/>
       </w:rPr>
       <w:drawing>
         <wp:anchor distT="0" distB="0" distL="114300" distR="114300" simplePos="0" relativeHeight="251659264" behindDoc="0" locked="0" layoutInCell="1" allowOverlap="1" wp14:anchorId="37AD6B34" wp14:editId="765F2ACC">
@@ -6521,7 +6504,7 @@
         <w:i/>
         <w:noProof/>
         <w:sz w:val="18"/>
-        <w:lang w:eastAsia="es-PE"/>
+        <w:lang w:val="es-ES"/>
       </w:rPr>
       <mc:AlternateContent>
         <mc:Choice Requires="wps">
@@ -6585,7 +6568,7 @@
             </wp:anchor>
           </w:drawing>
         </mc:Choice>
-        <mc:Fallback xmlns:w16sdtdh="http://schemas.microsoft.com/office/word/2020/wordml/sdtdatahash" xmlns:w16="http://schemas.microsoft.com/office/word/2018/wordml" xmlns:w16cex="http://schemas.microsoft.com/office/word/2018/wordml/cex">
+        <mc:Fallback xmlns:w16cex="http://schemas.microsoft.com/office/word/2018/wordml/cex" xmlns:w16="http://schemas.microsoft.com/office/word/2018/wordml" xmlns:w16sdtdh="http://schemas.microsoft.com/office/word/2020/wordml/sdtdatahash" xmlns:w16cid="http://schemas.microsoft.com/office/word/2016/wordml/cid" xmlns:am3d="http://schemas.microsoft.com/office/drawing/2017/model3d" xmlns:aink="http://schemas.microsoft.com/office/drawing/2016/ink" xmlns:cx8="http://schemas.microsoft.com/office/drawing/2016/5/14/chartex" xmlns:cx7="http://schemas.microsoft.com/office/drawing/2016/5/13/chartex" xmlns:cx6="http://schemas.microsoft.com/office/drawing/2016/5/12/chartex" xmlns:cx5="http://schemas.microsoft.com/office/drawing/2016/5/11/chartex" xmlns:cx4="http://schemas.microsoft.com/office/drawing/2016/5/10/chartex" xmlns:cx3="http://schemas.microsoft.com/office/drawing/2016/5/9/chartex" xmlns:cx2="http://schemas.microsoft.com/office/drawing/2015/10/21/chartex" xmlns:cx1="http://schemas.microsoft.com/office/drawing/2015/9/8/chartex">
           <w:pict>
             <v:shapetype w14:anchorId="3A2CA740" id="_x0000_t32" coordsize="21600,21600" o:spt="32" o:oned="t" path="m,l21600,21600e" filled="f">
               <v:path arrowok="t" fillok="f" o:connecttype="none"/>
@@ -6603,7 +6586,7 @@
 </file>
 
 <file path=word/numbering.xml><?xml version="1.0" encoding="utf-8"?>
-<w:numbering xmlns:wpc="http://schemas.microsoft.com/office/word/2010/wordprocessingCanvas" xmlns:cx="http://schemas.microsoft.com/office/drawing/2014/chartex" xmlns:cx1="http://schemas.microsoft.com/office/drawing/2015/9/8/chartex" xmlns:cx2="http://schemas.microsoft.com/office/drawing/2015/10/21/chartex" xmlns:cx3="http://schemas.microsoft.com/office/drawing/2016/5/9/chartex" xmlns:cx4="http://schemas.microsoft.com/office/drawing/2016/5/10/chartex" xmlns:cx5="http://schemas.microsoft.com/office/drawing/2016/5/11/chartex" xmlns:cx6="http://schemas.microsoft.com/office/drawing/2016/5/12/chartex" xmlns:cx7="http://schemas.microsoft.com/office/drawing/2016/5/13/chartex" xmlns:cx8="http://schemas.microsoft.com/office/drawing/2016/5/14/chartex" xmlns:mc="http://schemas.openxmlformats.org/markup-compatibility/2006" xmlns:aink="http://schemas.microsoft.com/office/drawing/2016/ink" xmlns:am3d="http://schemas.microsoft.com/office/drawing/2017/model3d" xmlns:o="urn:schemas-microsoft-com:office:office" xmlns:r="http://schemas.openxmlformats.org/officeDocument/2006/relationships" xmlns:m="http://schemas.openxmlformats.org/officeDocument/2006/math" xmlns:v="urn:schemas-microsoft-com:vml" xmlns:wp14="http://schemas.microsoft.com/office/word/2010/wordprocessingDrawing" xmlns:wp="http://schemas.openxmlformats.org/drawingml/2006/wordprocessingDrawing" xmlns:w10="urn:schemas-microsoft-com:office:word" xmlns:w="http://schemas.openxmlformats.org/wordprocessingml/2006/main" xmlns:w14="http://schemas.microsoft.com/office/word/2010/wordml" xmlns:w15="http://schemas.microsoft.com/office/word/2012/wordml" xmlns:w16cid="http://schemas.microsoft.com/office/word/2016/wordml/cid" xmlns:w16se="http://schemas.microsoft.com/office/word/2015/wordml/symex" xmlns:wpg="http://schemas.microsoft.com/office/word/2010/wordprocessingGroup" xmlns:wpi="http://schemas.microsoft.com/office/word/2010/wordprocessingInk" xmlns:wne="http://schemas.microsoft.com/office/word/2006/wordml" xmlns:wps="http://schemas.microsoft.com/office/word/2010/wordprocessingShape" mc:Ignorable="w14 w15 w16se w16cid wp14">
+<w:numbering xmlns:wpc="http://schemas.microsoft.com/office/word/2010/wordprocessingCanvas" xmlns:cx="http://schemas.microsoft.com/office/drawing/2014/chartex" xmlns:mc="http://schemas.openxmlformats.org/markup-compatibility/2006" xmlns:o="urn:schemas-microsoft-com:office:office" xmlns:r="http://schemas.openxmlformats.org/officeDocument/2006/relationships" xmlns:m="http://schemas.openxmlformats.org/officeDocument/2006/math" xmlns:v="urn:schemas-microsoft-com:vml" xmlns:wp14="http://schemas.microsoft.com/office/word/2010/wordprocessingDrawing" xmlns:wp="http://schemas.openxmlformats.org/drawingml/2006/wordprocessingDrawing" xmlns:w10="urn:schemas-microsoft-com:office:word" xmlns:w="http://schemas.openxmlformats.org/wordprocessingml/2006/main" xmlns:w14="http://schemas.microsoft.com/office/word/2010/wordml" xmlns:w15="http://schemas.microsoft.com/office/word/2012/wordml" xmlns:w16se="http://schemas.microsoft.com/office/word/2015/wordml/symex" xmlns:wpg="http://schemas.microsoft.com/office/word/2010/wordprocessingGroup" xmlns:wpi="http://schemas.microsoft.com/office/word/2010/wordprocessingInk" xmlns:wne="http://schemas.microsoft.com/office/word/2006/wordml" xmlns:wps="http://schemas.microsoft.com/office/word/2010/wordprocessingShape" mc:Ignorable="w14 w15 w16se wp14">
   <w:abstractNum w:abstractNumId="0" w15:restartNumberingAfterBreak="0">
     <w:nsid w:val="4B287954"/>
     <w:multiLevelType w:val="hybridMultilevel"/>
@@ -6697,7 +6680,7 @@
 </file>
 
 <file path=word/styles.xml><?xml version="1.0" encoding="utf-8"?>
-<w:styles xmlns:mc="http://schemas.openxmlformats.org/markup-compatibility/2006" xmlns:r="http://schemas.openxmlformats.org/officeDocument/2006/relationships" xmlns:w="http://schemas.openxmlformats.org/wordprocessingml/2006/main" xmlns:w14="http://schemas.microsoft.com/office/word/2010/wordml" xmlns:w15="http://schemas.microsoft.com/office/word/2012/wordml" xmlns:w16cid="http://schemas.microsoft.com/office/word/2016/wordml/cid" xmlns:w16se="http://schemas.microsoft.com/office/word/2015/wordml/symex" mc:Ignorable="w14 w15 w16se w16cid">
+<w:styles xmlns:mc="http://schemas.openxmlformats.org/markup-compatibility/2006" xmlns:r="http://schemas.openxmlformats.org/officeDocument/2006/relationships" xmlns:w="http://schemas.openxmlformats.org/wordprocessingml/2006/main" xmlns:w14="http://schemas.microsoft.com/office/word/2010/wordml" xmlns:w15="http://schemas.microsoft.com/office/word/2012/wordml" xmlns:w16se="http://schemas.microsoft.com/office/word/2015/wordml/symex" mc:Ignorable="w14 w15 w16se">
   <w:docDefaults>
     <w:rPrDefault>
       <w:rPr>
@@ -6715,7 +6698,7 @@
       </w:pPr>
     </w:pPrDefault>
   </w:docDefaults>
-  <w:latentStyles w:defLockedState="0" w:defUIPriority="99" w:defSemiHidden="0" w:defUnhideWhenUsed="0" w:defQFormat="0" w:count="375">
+  <w:latentStyles w:defLockedState="0" w:defUIPriority="99" w:defSemiHidden="0" w:defUnhideWhenUsed="0" w:defQFormat="0" w:count="371">
     <w:lsdException w:name="Normal" w:uiPriority="0" w:qFormat="1"/>
     <w:lsdException w:name="heading 1" w:uiPriority="9" w:qFormat="1"/>
     <w:lsdException w:name="heading 2" w:semiHidden="1" w:uiPriority="9" w:unhideWhenUsed="1" w:qFormat="1"/>
@@ -7087,10 +7070,6 @@
     <w:lsdException w:name="List Table 5 Dark Accent 6" w:uiPriority="50"/>
     <w:lsdException w:name="List Table 6 Colorful Accent 6" w:uiPriority="51"/>
     <w:lsdException w:name="List Table 7 Colorful Accent 6" w:uiPriority="52"/>
-    <w:lsdException w:name="Mention" w:semiHidden="1" w:unhideWhenUsed="1"/>
-    <w:lsdException w:name="Smart Hyperlink" w:semiHidden="1" w:unhideWhenUsed="1"/>
-    <w:lsdException w:name="Hashtag" w:semiHidden="1" w:unhideWhenUsed="1"/>
-    <w:lsdException w:name="Unresolved Mention" w:semiHidden="1" w:unhideWhenUsed="1"/>
   </w:latentStyles>
   <w:style w:type="paragraph" w:default="1" w:styleId="Normal">
     <w:name w:val="Normal"/>
@@ -7641,7 +7620,7 @@
 </file>
 
 <file path=customXml/itemProps1.xml><?xml version="1.0" encoding="utf-8"?>
-<ds:datastoreItem xmlns:ds="http://schemas.openxmlformats.org/officeDocument/2006/customXml" ds:itemID="{21F32DAA-9B5F-45D8-9AFB-A5BEDFB79BFA}">
+<ds:datastoreItem xmlns:ds="http://schemas.openxmlformats.org/officeDocument/2006/customXml" ds:itemID="{0C73FCD1-A3A2-4365-A469-74DDF48116ED}">
   <ds:schemaRefs>
     <ds:schemaRef ds:uri="http://schemas.openxmlformats.org/officeDocument/2006/bibliography"/>
   </ds:schemaRefs>

</xml_diff>